<commit_message>
Module 5: review-checklist skill, prototype and Word brief edits
</commit_message>
<xml_diff>
--- a/05-super-speed/product-brief.docx
+++ b/05-super-speed/product-brief.docx
@@ -434,25 +434,7 @@
                 <w:sz w:val="20"/>
                 <w:szCs w:val="20"/>
               </w:rPr>
-              <w:t xml:space="preserve">A status like Teams: tap </w:t>
-            </w:r>
-            <w:r>
-              <w:rPr>
-                <w:rFonts w:ascii="Calibri" w:eastAsia="Times New Roman" w:hAnsi="Calibri" w:cs="Calibri"/>
-                <w:b/>
-                <w:bCs/>
-                <w:sz w:val="20"/>
-                <w:szCs w:val="20"/>
-              </w:rPr>
-              <w:t>Available</w:t>
-            </w:r>
-            <w:r>
-              <w:rPr>
-                <w:rFonts w:ascii="Calibri" w:eastAsia="Times New Roman" w:hAnsi="Calibri" w:cs="Calibri"/>
-                <w:sz w:val="20"/>
-                <w:szCs w:val="20"/>
-              </w:rPr>
-              <w:t xml:space="preserve"> to switch to </w:t>
+              <w:t xml:space="preserve">A Teams-style status: one tap sets </w:t>
             </w:r>
             <w:r>
               <w:rPr>
@@ -470,7 +452,7 @@
                 <w:sz w:val="20"/>
                 <w:szCs w:val="20"/>
               </w:rPr>
-              <w:t xml:space="preserve"> and set the time pings come back on. Away means no pings, so being busy never counts as a miss.</w:t>
+              <w:t>, optionally back on in 1 hour or at a set time. No pings while Away, so being busy never counts as a miss.</w:t>
             </w:r>
           </w:p>
         </w:tc>
@@ -1067,122 +1049,9 @@
 <file path=word/numbering.xml><?xml version="1.0" encoding="utf-8"?>
 <w:numbering xmlns:wpc="http://schemas.microsoft.com/office/word/2010/wordprocessingCanvas" xmlns:cx="http://schemas.microsoft.com/office/drawing/2014/chartex" xmlns:cx1="http://schemas.microsoft.com/office/drawing/2015/9/8/chartex" xmlns:cx2="http://schemas.microsoft.com/office/drawing/2015/10/21/chartex" xmlns:cx3="http://schemas.microsoft.com/office/drawing/2016/5/9/chartex" xmlns:cx4="http://schemas.microsoft.com/office/drawing/2016/5/10/chartex" xmlns:cx5="http://schemas.microsoft.com/office/drawing/2016/5/11/chartex" xmlns:cx6="http://schemas.microsoft.com/office/drawing/2016/5/12/chartex" xmlns:cx7="http://schemas.microsoft.com/office/drawing/2016/5/13/chartex" xmlns:cx8="http://schemas.microsoft.com/office/drawing/2016/5/14/chartex" xmlns:mc="http://schemas.openxmlformats.org/markup-compatibility/2006" xmlns:aink="http://schemas.microsoft.com/office/drawing/2016/ink" xmlns:am3d="http://schemas.microsoft.com/office/drawing/2017/model3d" xmlns:o="urn:schemas-microsoft-com:office:office" xmlns:oel="http://schemas.microsoft.com/office/2019/extlst" xmlns:r="http://schemas.openxmlformats.org/officeDocument/2006/relationships" xmlns:m="http://schemas.openxmlformats.org/officeDocument/2006/math" xmlns:v="urn:schemas-microsoft-com:vml" xmlns:wp14="http://schemas.microsoft.com/office/word/2010/wordprocessingDrawing" xmlns:wp="http://schemas.openxmlformats.org/drawingml/2006/wordprocessingDrawing" xmlns:w10="urn:schemas-microsoft-com:office:word" xmlns:w="http://schemas.openxmlformats.org/wordprocessingml/2006/main" xmlns:w14="http://schemas.microsoft.com/office/word/2010/wordml" xmlns:w15="http://schemas.microsoft.com/office/word/2012/wordml" xmlns:w16cex="http://schemas.microsoft.com/office/word/2018/wordml/cex" xmlns:w16cid="http://schemas.microsoft.com/office/word/2016/wordml/cid" xmlns:w16="http://schemas.microsoft.com/office/word/2018/wordml" xmlns:w16du="http://schemas.microsoft.com/office/word/2023/wordml/word16du" xmlns:w16sdtdh="http://schemas.microsoft.com/office/word/2020/wordml/sdtdatahash" xmlns:w16sdtfl="http://schemas.microsoft.com/office/word/2024/wordml/sdtformatlock" xmlns:w16se="http://schemas.microsoft.com/office/word/2015/wordml/symex" xmlns:wpg="http://schemas.microsoft.com/office/word/2010/wordprocessingGroup" xmlns:wpi="http://schemas.microsoft.com/office/word/2010/wordprocessingInk" xmlns:wne="http://schemas.microsoft.com/office/word/2006/wordml" xmlns:wps="http://schemas.microsoft.com/office/word/2010/wordprocessingShape" mc:Ignorable="w14 w15 w16se w16cid w16 w16cex w16sdtdh w16sdtfl w16du wp14">
   <w:abstractNum w:abstractNumId="0" w15:restartNumberingAfterBreak="0">
-    <w:nsid w:val="304F1360"/>
+    <w:nsid w:val="3D942507"/>
     <w:multiLevelType w:val="multilevel"/>
-    <w:tmpl w:val="157A61F0"/>
-    <w:lvl w:ilvl="0">
-      <w:start w:val="1"/>
-      <w:numFmt w:val="decimal"/>
-      <w:lvlText w:val="%1."/>
-      <w:lvlJc w:val="left"/>
-      <w:pPr>
-        <w:tabs>
-          <w:tab w:val="num" w:pos="720"/>
-        </w:tabs>
-        <w:ind w:left="720" w:hanging="360"/>
-      </w:pPr>
-    </w:lvl>
-    <w:lvl w:ilvl="1" w:tentative="1">
-      <w:start w:val="1"/>
-      <w:numFmt w:val="decimal"/>
-      <w:lvlText w:val="%2."/>
-      <w:lvlJc w:val="left"/>
-      <w:pPr>
-        <w:tabs>
-          <w:tab w:val="num" w:pos="1440"/>
-        </w:tabs>
-        <w:ind w:left="1440" w:hanging="360"/>
-      </w:pPr>
-    </w:lvl>
-    <w:lvl w:ilvl="2" w:tentative="1">
-      <w:start w:val="1"/>
-      <w:numFmt w:val="decimal"/>
-      <w:lvlText w:val="%3."/>
-      <w:lvlJc w:val="left"/>
-      <w:pPr>
-        <w:tabs>
-          <w:tab w:val="num" w:pos="2160"/>
-        </w:tabs>
-        <w:ind w:left="2160" w:hanging="360"/>
-      </w:pPr>
-    </w:lvl>
-    <w:lvl w:ilvl="3" w:tentative="1">
-      <w:start w:val="1"/>
-      <w:numFmt w:val="decimal"/>
-      <w:lvlText w:val="%4."/>
-      <w:lvlJc w:val="left"/>
-      <w:pPr>
-        <w:tabs>
-          <w:tab w:val="num" w:pos="2880"/>
-        </w:tabs>
-        <w:ind w:left="2880" w:hanging="360"/>
-      </w:pPr>
-    </w:lvl>
-    <w:lvl w:ilvl="4" w:tentative="1">
-      <w:start w:val="1"/>
-      <w:numFmt w:val="decimal"/>
-      <w:lvlText w:val="%5."/>
-      <w:lvlJc w:val="left"/>
-      <w:pPr>
-        <w:tabs>
-          <w:tab w:val="num" w:pos="3600"/>
-        </w:tabs>
-        <w:ind w:left="3600" w:hanging="360"/>
-      </w:pPr>
-    </w:lvl>
-    <w:lvl w:ilvl="5" w:tentative="1">
-      <w:start w:val="1"/>
-      <w:numFmt w:val="decimal"/>
-      <w:lvlText w:val="%6."/>
-      <w:lvlJc w:val="left"/>
-      <w:pPr>
-        <w:tabs>
-          <w:tab w:val="num" w:pos="4320"/>
-        </w:tabs>
-        <w:ind w:left="4320" w:hanging="360"/>
-      </w:pPr>
-    </w:lvl>
-    <w:lvl w:ilvl="6" w:tentative="1">
-      <w:start w:val="1"/>
-      <w:numFmt w:val="decimal"/>
-      <w:lvlText w:val="%7."/>
-      <w:lvlJc w:val="left"/>
-      <w:pPr>
-        <w:tabs>
-          <w:tab w:val="num" w:pos="5040"/>
-        </w:tabs>
-        <w:ind w:left="5040" w:hanging="360"/>
-      </w:pPr>
-    </w:lvl>
-    <w:lvl w:ilvl="7" w:tentative="1">
-      <w:start w:val="1"/>
-      <w:numFmt w:val="decimal"/>
-      <w:lvlText w:val="%8."/>
-      <w:lvlJc w:val="left"/>
-      <w:pPr>
-        <w:tabs>
-          <w:tab w:val="num" w:pos="5760"/>
-        </w:tabs>
-        <w:ind w:left="5760" w:hanging="360"/>
-      </w:pPr>
-    </w:lvl>
-    <w:lvl w:ilvl="8" w:tentative="1">
-      <w:start w:val="1"/>
-      <w:numFmt w:val="decimal"/>
-      <w:lvlText w:val="%9."/>
-      <w:lvlJc w:val="left"/>
-      <w:pPr>
-        <w:tabs>
-          <w:tab w:val="num" w:pos="6480"/>
-        </w:tabs>
-        <w:ind w:left="6480" w:hanging="360"/>
-      </w:pPr>
-    </w:lvl>
-  </w:abstractNum>
-  <w:abstractNum w:abstractNumId="1" w15:restartNumberingAfterBreak="0">
-    <w:nsid w:val="455512BE"/>
-    <w:multiLevelType w:val="multilevel"/>
-    <w:tmpl w:val="B7920AF6"/>
+    <w:tmpl w:val="C4DCC9DA"/>
     <w:lvl w:ilvl="0">
       <w:start w:val="1"/>
       <w:numFmt w:val="bullet"/>
@@ -1328,11 +1197,124 @@
       </w:rPr>
     </w:lvl>
   </w:abstractNum>
-  <w:num w:numId="1" w16cid:durableId="1623419768">
+  <w:abstractNum w:abstractNumId="1" w15:restartNumberingAfterBreak="0">
+    <w:nsid w:val="79FF0894"/>
+    <w:multiLevelType w:val="multilevel"/>
+    <w:tmpl w:val="7D907822"/>
+    <w:lvl w:ilvl="0">
+      <w:start w:val="1"/>
+      <w:numFmt w:val="decimal"/>
+      <w:lvlText w:val="%1."/>
+      <w:lvlJc w:val="left"/>
+      <w:pPr>
+        <w:tabs>
+          <w:tab w:val="num" w:pos="720"/>
+        </w:tabs>
+        <w:ind w:left="720" w:hanging="360"/>
+      </w:pPr>
+    </w:lvl>
+    <w:lvl w:ilvl="1" w:tentative="1">
+      <w:start w:val="1"/>
+      <w:numFmt w:val="decimal"/>
+      <w:lvlText w:val="%2."/>
+      <w:lvlJc w:val="left"/>
+      <w:pPr>
+        <w:tabs>
+          <w:tab w:val="num" w:pos="1440"/>
+        </w:tabs>
+        <w:ind w:left="1440" w:hanging="360"/>
+      </w:pPr>
+    </w:lvl>
+    <w:lvl w:ilvl="2" w:tentative="1">
+      <w:start w:val="1"/>
+      <w:numFmt w:val="decimal"/>
+      <w:lvlText w:val="%3."/>
+      <w:lvlJc w:val="left"/>
+      <w:pPr>
+        <w:tabs>
+          <w:tab w:val="num" w:pos="2160"/>
+        </w:tabs>
+        <w:ind w:left="2160" w:hanging="360"/>
+      </w:pPr>
+    </w:lvl>
+    <w:lvl w:ilvl="3" w:tentative="1">
+      <w:start w:val="1"/>
+      <w:numFmt w:val="decimal"/>
+      <w:lvlText w:val="%4."/>
+      <w:lvlJc w:val="left"/>
+      <w:pPr>
+        <w:tabs>
+          <w:tab w:val="num" w:pos="2880"/>
+        </w:tabs>
+        <w:ind w:left="2880" w:hanging="360"/>
+      </w:pPr>
+    </w:lvl>
+    <w:lvl w:ilvl="4" w:tentative="1">
+      <w:start w:val="1"/>
+      <w:numFmt w:val="decimal"/>
+      <w:lvlText w:val="%5."/>
+      <w:lvlJc w:val="left"/>
+      <w:pPr>
+        <w:tabs>
+          <w:tab w:val="num" w:pos="3600"/>
+        </w:tabs>
+        <w:ind w:left="3600" w:hanging="360"/>
+      </w:pPr>
+    </w:lvl>
+    <w:lvl w:ilvl="5" w:tentative="1">
+      <w:start w:val="1"/>
+      <w:numFmt w:val="decimal"/>
+      <w:lvlText w:val="%6."/>
+      <w:lvlJc w:val="left"/>
+      <w:pPr>
+        <w:tabs>
+          <w:tab w:val="num" w:pos="4320"/>
+        </w:tabs>
+        <w:ind w:left="4320" w:hanging="360"/>
+      </w:pPr>
+    </w:lvl>
+    <w:lvl w:ilvl="6" w:tentative="1">
+      <w:start w:val="1"/>
+      <w:numFmt w:val="decimal"/>
+      <w:lvlText w:val="%7."/>
+      <w:lvlJc w:val="left"/>
+      <w:pPr>
+        <w:tabs>
+          <w:tab w:val="num" w:pos="5040"/>
+        </w:tabs>
+        <w:ind w:left="5040" w:hanging="360"/>
+      </w:pPr>
+    </w:lvl>
+    <w:lvl w:ilvl="7" w:tentative="1">
+      <w:start w:val="1"/>
+      <w:numFmt w:val="decimal"/>
+      <w:lvlText w:val="%8."/>
+      <w:lvlJc w:val="left"/>
+      <w:pPr>
+        <w:tabs>
+          <w:tab w:val="num" w:pos="5760"/>
+        </w:tabs>
+        <w:ind w:left="5760" w:hanging="360"/>
+      </w:pPr>
+    </w:lvl>
+    <w:lvl w:ilvl="8" w:tentative="1">
+      <w:start w:val="1"/>
+      <w:numFmt w:val="decimal"/>
+      <w:lvlText w:val="%9."/>
+      <w:lvlJc w:val="left"/>
+      <w:pPr>
+        <w:tabs>
+          <w:tab w:val="num" w:pos="6480"/>
+        </w:tabs>
+        <w:ind w:left="6480" w:hanging="360"/>
+      </w:pPr>
+    </w:lvl>
+  </w:abstractNum>
+  <w:num w:numId="1" w16cid:durableId="416946346">
+    <w:abstractNumId w:val="0"/>
+  </w:num>
+  <w:num w:numId="2" w16cid:durableId="515271349">
     <w:abstractNumId w:val="1"/>
-  </w:num>
-  <w:num w:numId="2" w16cid:durableId="1603878553">
-    <w:abstractNumId w:val="0"/>
   </w:num>
 </w:numbering>
 </file>

</xml_diff>

<commit_message>
Module 5: confirm 4-week success window; apply checklist fixes to Word brief
</commit_message>
<xml_diff>
--- a/05-super-speed/product-brief.docx
+++ b/05-super-speed/product-brief.docx
@@ -37,6 +37,25 @@
     </w:p>
     <w:p>
       <w:pPr>
+        <w:pStyle w:val="meta"/>
+        <w:spacing w:after="100"/>
+        <w:rPr>
+          <w:rFonts w:ascii="Calibri" w:hAnsi="Calibri" w:cs="Calibri"/>
+          <w:sz w:val="21"/>
+          <w:szCs w:val="21"/>
+        </w:rPr>
+      </w:pPr>
+      <w:r>
+        <w:rPr>
+          <w:rFonts w:ascii="Calibri" w:hAnsi="Calibri" w:cs="Calibri"/>
+          <w:sz w:val="21"/>
+          <w:szCs w:val="21"/>
+        </w:rPr>
+        <w:t>Owner: Jessica Zalecki, PM, Rook Dispatch</w:t>
+      </w:r>
+    </w:p>
+    <w:p>
+      <w:pPr>
         <w:pStyle w:val="bl"/>
         <w:rPr>
           <w:rFonts w:ascii="Calibri" w:hAnsi="Calibri" w:cs="Calibri"/>
@@ -78,7 +97,7 @@
           <w:sz w:val="21"/>
           <w:szCs w:val="21"/>
         </w:rPr>
-        <w:t xml:space="preserve"> the 60-second ping wait, showing responders and handlers what's happening, and fixing the scoring underneath. </w:t>
+        <w:t xml:space="preserve"> the 60-second ping wait, showing responders and handlers what's happening, letting responders set themselves Away, and fixing the scoring underneath. </w:t>
       </w:r>
       <w:r>
         <w:rPr>
@@ -883,7 +902,7 @@
           <w:sz w:val="21"/>
           <w:szCs w:val="21"/>
         </w:rPr>
-        <w:t>Vesper back to ~10 Old Town callouts a week · missed pings from 18% to ~2% · acceptance rate from 64% to ~77% · fewer "phone never goes off" tickets.</w:t>
+        <w:t>Within 4 weeks of the release that ships this: Vesper back to ~10 Old Town callouts a week · missed pings from 18% to ~2% · acceptance rate from 64% to ~77% · callout tickets back to their pre-4.2 weekly level (about a third of the rate since 4.2).</w:t>
       </w:r>
     </w:p>
     <w:p>

</xml_diff>

<commit_message>
Module 5: brief edits from partner review (cause, reset, risks, success measures, privacy)
</commit_message>
<xml_diff>
--- a/05-super-speed/product-brief.docx
+++ b/05-super-speed/product-brief.docx
@@ -147,7 +147,7 @@
           <w:sz w:val="21"/>
           <w:szCs w:val="21"/>
         </w:rPr>
-        <w:t>Vesper (Old Town) took 11–12 callouts a week before 4.2. Then it was 6, then 1, then 0. Old Town got busier, but 28 callouts went to Nightwell and Captain Vantage instead. Vesper's handler, Aunt Dot, hears the phone buzz on the kitchen counter and shouts upstairs, and by the time Vesper answers, "it's gone." Then come weeks when the phone just sits there.</w:t>
+        <w:t>Vesper (Old Town) took 11–12 callouts a week before 4.2. Then it was 6, then 1, then 0. Old Town got busier, but 28 callouts went to Nightwell and Captain Vantage instead. Vesper's handler, Aunt Dot, says that by the time Vesper answers, "it's gone." Then come weeks when the phone just sits there.</w:t>
       </w:r>
     </w:p>
     <w:p>
@@ -211,6 +211,38 @@
           <w:sz w:val="21"/>
           <w:szCs w:val="21"/>
         </w:rPr>
+        <w:t>Cause not yet proven:</w:t>
+      </w:r>
+      <w:r>
+        <w:rPr>
+          <w:rFonts w:ascii="Calibri" w:eastAsia="Times New Roman" w:hAnsi="Calibri" w:cs="Calibri"/>
+          <w:sz w:val="21"/>
+          <w:szCs w:val="21"/>
+        </w:rPr>
+        <w:t xml:space="preserve"> we don't know whether misses are slow answers or pushes that never arrive. Marcus to pull push delivery logs for the four; the full-screen ping only fixes slow answers.</w:t>
+      </w:r>
+    </w:p>
+    <w:p>
+      <w:pPr>
+        <w:numPr>
+          <w:ilvl w:val="0"/>
+          <w:numId w:val="1"/>
+        </w:numPr>
+        <w:spacing w:after="40"/>
+        <w:rPr>
+          <w:rFonts w:ascii="Calibri" w:eastAsia="Times New Roman" w:hAnsi="Calibri" w:cs="Calibri"/>
+          <w:sz w:val="21"/>
+          <w:szCs w:val="21"/>
+        </w:rPr>
+      </w:pPr>
+      <w:r>
+        <w:rPr>
+          <w:rFonts w:ascii="Calibri" w:eastAsia="Times New Roman" w:hAnsi="Calibri" w:cs="Calibri"/>
+          <w:b/>
+          <w:bCs/>
+          <w:sz w:val="21"/>
+          <w:szCs w:val="21"/>
+        </w:rPr>
         <w:t>Not just Vesper:</w:t>
       </w:r>
       <w:r>
@@ -219,7 +251,7 @@
           <w:sz w:val="21"/>
           <w:szCs w:val="21"/>
         </w:rPr>
-        <w:t xml:space="preserve"> Meteor Mite, The Undertow and Farlight fell from 9–12 callouts a week to about 1. Four other responders picked up 20–35% more pings. There are 45 callout tickets, all still open.</w:t>
+        <w:t xml:space="preserve"> Meteor Mite, The Undertow and Farlight fell from 9–12 callouts a week to about 1. Four other responders picked up 25–45% more pings. There are 45 callout tickets, all still open.</w:t>
       </w:r>
     </w:p>
     <w:p>
@@ -796,7 +828,7 @@
                 <w:sz w:val="20"/>
                 <w:szCs w:val="20"/>
               </w:rPr>
-              <w:t xml:space="preserve">Reset the four responders' scores now. </w:t>
+              <w:t xml:space="preserve">Reset the four responders' scores to their level on 11 Aug, the day before 4.2. The reset only holds if misses expire and the "your turn" guarantee ship too. </w:t>
             </w:r>
             <w:r>
               <w:rPr>
@@ -870,7 +902,7 @@
           <w:sz w:val="21"/>
           <w:szCs w:val="21"/>
         </w:rPr>
-        <w:t>Not changing the 60s ping wait · not reverting the proximity change · handlers can't take pings for responders · no raw scores shown · cover identity untouched.</w:t>
+        <w:t>Not changing the 60s ping wait · not reverting the proximity change · handlers can't take pings for responders · no raw scores shown · cover identity untouched · not capping load on busy responders (separate decision).</w:t>
       </w:r>
     </w:p>
     <w:p>
@@ -884,11 +916,89 @@
         <w:rPr>
           <w:rFonts w:ascii="Calibri" w:eastAsia="Times New Roman" w:hAnsi="Calibri" w:cs="Calibri"/>
         </w:rPr>
-        <w:t>Success looks like</w:t>
+        <w:t>Risks</w:t>
       </w:r>
     </w:p>
     <w:p>
       <w:pPr>
+        <w:numPr>
+          <w:ilvl w:val="0"/>
+          <w:numId w:val="1"/>
+        </w:numPr>
+        <w:spacing w:after="40"/>
+        <w:rPr>
+          <w:rFonts w:ascii="Calibri" w:eastAsia="Times New Roman" w:hAnsi="Calibri" w:cs="Calibri"/>
+          <w:sz w:val="21"/>
+          <w:szCs w:val="21"/>
+        </w:rPr>
+      </w:pPr>
+      <w:r>
+        <w:rPr>
+          <w:rFonts w:ascii="Calibri" w:eastAsia="Times New Roman" w:hAnsi="Calibri" w:cs="Calibri"/>
+          <w:b/>
+          <w:bCs/>
+          <w:sz w:val="21"/>
+          <w:szCs w:val="21"/>
+        </w:rPr>
+        <w:t>Coverage:</w:t>
+      </w:r>
+      <w:r>
+        <w:rPr>
+          <w:rFonts w:ascii="Calibri" w:eastAsia="Times New Roman" w:hAnsi="Calibri" w:cs="Calibri"/>
+          <w:sz w:val="21"/>
+          <w:szCs w:val="21"/>
+        </w:rPr>
+        <w:t xml:space="preserve"> if several nearby responders go Away at once, callouts needing rare tags may go unfilled.</w:t>
+      </w:r>
+    </w:p>
+    <w:p>
+      <w:pPr>
+        <w:numPr>
+          <w:ilvl w:val="0"/>
+          <w:numId w:val="1"/>
+        </w:numPr>
+        <w:spacing w:after="40"/>
+        <w:rPr>
+          <w:rFonts w:ascii="Calibri" w:eastAsia="Times New Roman" w:hAnsi="Calibri" w:cs="Calibri"/>
+          <w:sz w:val="21"/>
+          <w:szCs w:val="21"/>
+        </w:rPr>
+      </w:pPr>
+      <w:r>
+        <w:rPr>
+          <w:rFonts w:ascii="Calibri" w:eastAsia="Times New Roman" w:hAnsi="Calibri" w:cs="Calibri"/>
+          <w:b/>
+          <w:bCs/>
+          <w:sz w:val="21"/>
+          <w:szCs w:val="21"/>
+        </w:rPr>
+        <w:t>Guardrail:</w:t>
+      </w:r>
+      <w:r>
+        <w:rPr>
+          <w:rFonts w:ascii="Calibri" w:eastAsia="Times New Roman" w:hAnsi="Calibri" w:cs="Calibri"/>
+          <w:sz w:val="21"/>
+          <w:szCs w:val="21"/>
+        </w:rPr>
+        <w:t xml:space="preserve"> untaken callouts must not rise above 11% (their post-4.2 level).</w:t>
+      </w:r>
+    </w:p>
+    <w:p>
+      <w:pPr>
+        <w:pStyle w:val="Heading2"/>
+        <w:rPr>
+          <w:rFonts w:ascii="Calibri" w:eastAsia="Times New Roman" w:hAnsi="Calibri" w:cs="Calibri"/>
+        </w:rPr>
+      </w:pPr>
+      <w:r>
+        <w:rPr>
+          <w:rFonts w:ascii="Calibri" w:eastAsia="Times New Roman" w:hAnsi="Calibri" w:cs="Calibri"/>
+        </w:rPr>
+        <w:t>Success looks like</w:t>
+      </w:r>
+    </w:p>
+    <w:p>
+      <w:pPr>
         <w:pStyle w:val="NormalWeb"/>
         <w:rPr>
           <w:rFonts w:ascii="Calibri" w:hAnsi="Calibri" w:cs="Calibri"/>
@@ -902,7 +1012,7 @@
           <w:sz w:val="21"/>
           <w:szCs w:val="21"/>
         </w:rPr>
-        <w:t>Within 4 weeks of the release that ships this: Vesper back to ~10 Old Town callouts a week · missed pings from 18% to ~2% · acceptance rate from 64% to ~77% · callout tickets back to their pre-4.2 weekly level (about a third of the rate since 4.2).</w:t>
+        <w:t>Within 4 weeks of the release that ships this: Vesper, Meteor Mite, The Undertow and Farlight each back to 8+ pings a week · missed pings from 13% (latest week) to ~2% · acceptance rate from 73% (latest week) to ~77% · callout tickets back to their pre-4.2 weekly level (about a third of the rate since 4.2).</w:t>
       </w:r>
     </w:p>
     <w:p>
@@ -948,7 +1058,7 @@
           <w:sz w:val="21"/>
           <w:szCs w:val="21"/>
         </w:rPr>
-        <w:t xml:space="preserve"> reset the four responders' scores now, ahead of the app work?</w:t>
+        <w:t xml:space="preserve"> reset the four responders' scores now, ahead of the app work? These four are the ones the ping data shows; Ravi to check for others.</w:t>
       </w:r>
     </w:p>
     <w:p>
@@ -1020,7 +1130,7 @@
           <w:sz w:val="21"/>
           <w:szCs w:val="21"/>
         </w:rPr>
-        <w:t xml:space="preserve"> confirm production scores the same way the repo does (Vesper's 18 Aug skip is still unexplained).</w:t>
+        <w:t xml:space="preserve"> confirm production scores the same way the repo does, and that a reset survives a restart (Vesper's 18 Aug skip is still unexplained).</w:t>
       </w:r>
     </w:p>
     <w:p>

</xml_diff>